<commit_message>
Thêm cột tên nội bộ vô danh mục nguyên liệu master, thành phẩm/btp. Thêm phần quản lý mã QR cho lot nhập và tên hàng hóa
</commit_message>
<xml_diff>
--- a/docs/quick-guide/Quick-Guide-ZencosMS.docx
+++ b/docs/quick-guide/Quick-Guide-ZencosMS.docx
@@ -17,7 +17,7 @@
         <w:jc w:val="center"/>
       </w:pPr>
       <w:r>
-        <w:t xml:space="preserve">Ngày tạo: 3/6/2026</w:t>
+        <w:t xml:space="preserve">Ngày tạo: 9/6/2026</w:t>
       </w:r>
     </w:p>
     <w:p>
@@ -973,7 +973,7 @@
       <w:r>
         <w:drawing>
           <wp:inline distT="0" distB="0" distL="0" distR="0">
-            <wp:extent cx="10048875" cy="5905500"/>
+            <wp:extent cx="6238875" cy="5905500"/>
             <wp:effectExtent t="0" r="0" b="0" l="0"/>
             <wp:docPr id="1" name="" descr="" title=""/>
             <wp:cNvGraphicFramePr>
@@ -998,7 +998,7 @@
                   <pic:spPr bwMode="auto">
                     <a:xfrm>
                       <a:off x="0" y="0"/>
-                      <a:ext cx="10048875" cy="5905500"/>
+                      <a:ext cx="6238875" cy="5905500"/>
                     </a:xfrm>
                     <a:prstGeom prst="rect">
                       <a:avLst/>
@@ -1064,7 +1064,7 @@
       <w:r>
         <w:drawing>
           <wp:inline distT="0" distB="0" distL="0" distR="0">
-            <wp:extent cx="5905500" cy="5905500"/>
+            <wp:extent cx="4505325" cy="5905500"/>
             <wp:effectExtent t="0" r="0" b="0" l="0"/>
             <wp:docPr id="1" name="" descr="" title=""/>
             <wp:cNvGraphicFramePr>
@@ -1089,7 +1089,7 @@
                   <pic:spPr bwMode="auto">
                     <a:xfrm>
                       <a:off x="0" y="0"/>
-                      <a:ext cx="5905500" cy="5905500"/>
+                      <a:ext cx="4505325" cy="5905500"/>
                     </a:xfrm>
                     <a:prstGeom prst="rect">
                       <a:avLst/>
@@ -1593,22 +1593,27 @@
         <w:spacing w:after="120" w:before="260"/>
       </w:pPr>
       <w:r>
-        <w:t xml:space="preserve">Bước 13. Danh mục (Catalogs)</w:t>
-      </w:r>
-    </w:p>
-    <w:p>
-      <w:r>
-        <w:t xml:space="preserve">- Quản lý mã NVL, danh mục cơ bản và sản phẩm đầu ra.</w:t>
-      </w:r>
-    </w:p>
-    <w:p>
-      <w:r>
-        <w:t xml:space="preserve">- Import/Export file danh mục để cập nhật hàng loạt.</w:t>
-      </w:r>
-    </w:p>
-    <w:p>
-      <w:r>
-        <w:t xml:space="preserve">- Đảm bảo không trùng mã và dữ liệu bắt buộc đầy đủ trước khi lưu.</w:t>
+        <w:t xml:space="preserve">Bước 13. Lập phiếu xuất kho TP</w:t>
+      </w:r>
+    </w:p>
+    <w:p>
+      <w:r>
+        <w:t xml:space="preserve">- Tạo phiếu xuất mới, chọn khách hàng và nhập hình thức thanh toán.</w:t>
+      </w:r>
+    </w:p>
+    <w:p>
+      <w:r>
+        <w:t xml:space="preserve">- Khai báo ngày xuất, người giao hàng, phương thức vận chuyển và số vận đơn.</w:t>
+      </w:r>
+    </w:p>
+    <w:p>
+      <w:r>
+        <w:t xml:space="preserve">- Chọn sản phẩm, nhập số lô, số lượng và đơn giá. Hệ thống tự động tính thành tiền.</w:t>
+      </w:r>
+    </w:p>
+    <w:p>
+      <w:r>
+        <w:t xml:space="preserve">- Xác nhận toàn bộ phiếu khi dữ liệu đã chính xác, hệ thống sẽ cập nhật tồn kho TP tương ứng.</w:t>
       </w:r>
     </w:p>
     <w:p>
@@ -1659,6 +1664,19 @@
     </w:p>
     <w:p>
       <w:pPr>
+        <w:spacing w:after="60" w:before="40"/>
+        <w:jc w:val="center"/>
+      </w:pPr>
+      <w:r>
+        <w:rPr>
+          <w:i/>
+          <w:iCs/>
+        </w:rPr>
+        <w:t xml:space="preserve">Biểu mẫu phiếu xuất kho thành phẩm hoàn chỉnh</w:t>
+      </w:r>
+    </w:p>
+    <w:p>
+      <w:pPr>
         <w:spacing w:after="40" w:before="20"/>
       </w:pPr>
       <w:r>
@@ -1671,12 +1689,27 @@
     </w:p>
     <w:p>
       <w:r>
-        <w:t xml:space="preserve">(1) Thực hiện import dữ liệu danh mục hàng loạt từ file mẫu, giảm thao tác nhập tay và đồng bộ dữ liệu chuẩn hóa.</w:t>
-      </w:r>
-    </w:p>
-    <w:p>
-      <w:r>
-        <w:t xml:space="preserve">(2) Vùng quản trị danh mục gốc của hệ thống (NVL, thành phẩm, đơn vị, nhóm...) ảnh hưởng trực tiếp đến dữ liệu nghiệp vụ.</w:t>
+        <w:t xml:space="preserve">(1) THÔNG TIN KHÁCH HÀNG: Nhập mã khách hàng, tên khách hàng, hình thức thanh toán: Đây là vùng thao tác quan trọng của bước hiện tại. Thực hiện đúng trình tự nhập liệu, kiểm tra lại dữ liệu trước khi lưu/xác nhận để tránh sai lệch nghiệp vụ.</w:t>
+      </w:r>
+    </w:p>
+    <w:p>
+      <w:r>
+        <w:t xml:space="preserve">(2) THÔNG TIN XUẤT KHO &amp; VẬN CHUYỂN: Chọn ngày xuất, nhập người giao, phương thức vận chuyển: Đây là vùng thao tác quan trọng của bước hiện tại. Thực hiện đúng trình tự nhập liệu, kiểm tra lại dữ liệu trước khi lưu/xác nhận để tránh sai lệch nghiệp vụ.</w:t>
+      </w:r>
+    </w:p>
+    <w:p>
+      <w:r>
+        <w:t xml:space="preserve">(4) BẢNG CHI TIẾT HÀNG HÓA: Chọn sản phẩm, nhập số lô, số lượng, đơn giá: Đây là vùng thao tác quan trọng của bước hiện tại. Thực hiện đúng trình tự nhập liệu, kiểm tra lại dữ liệu trước khi lưu/xác nhận để tránh sai lệch nghiệp vụ.</w:t>
+      </w:r>
+    </w:p>
+    <w:p>
+      <w:r>
+        <w:t xml:space="preserve">(6) LƯU NHÁP: Lưu phiếu ở trạng thái nháp để sửa sau: Đây là vùng thao tác quan trọng của bước hiện tại. Thực hiện đúng trình tự nhập liệu, kiểm tra lại dữ liệu trước khi lưu/xác nhận để tránh sai lệch nghiệp vụ.</w:t>
+      </w:r>
+    </w:p>
+    <w:p>
+      <w:r>
+        <w:t xml:space="preserve">(7) XÁC NHẬN XUẤT KHO: Hoàn tất phiếu xuất kho: Đây là vùng thao tác quan trọng của bước hiện tại. Thực hiện đúng trình tự nhập liệu, kiểm tra lại dữ liệu trước khi lưu/xác nhận để tránh sai lệch nghiệp vụ.</w:t>
       </w:r>
     </w:p>
     <w:p>
@@ -1685,22 +1718,22 @@
         <w:spacing w:after="120" w:before="260"/>
       </w:pPr>
       <w:r>
-        <w:t xml:space="preserve">Bước 14. Khai báo tồn kho đầu kỳ</w:t>
-      </w:r>
-    </w:p>
-    <w:p>
-      <w:r>
-        <w:t xml:space="preserve">- Nhập thông tin lô, số lượng, đơn giá, nhà cung cấp và ngày liên quan.</w:t>
-      </w:r>
-    </w:p>
-    <w:p>
-      <w:r>
-        <w:t xml:space="preserve">- Nhập số lượng theo quy tắc parse và format thống nhất trong hệ thống.</w:t>
-      </w:r>
-    </w:p>
-    <w:p>
-      <w:r>
-        <w:t xml:space="preserve">- Import file nếu cần khởi tạo nhiều dòng dữ liệu.</w:t>
+        <w:t xml:space="preserve">Bước 15. Danh mục (Catalogs)</w:t>
+      </w:r>
+    </w:p>
+    <w:p>
+      <w:r>
+        <w:t xml:space="preserve">- Quản lý mã NVL, danh mục cơ bản và sản phẩm đầu ra.</w:t>
+      </w:r>
+    </w:p>
+    <w:p>
+      <w:r>
+        <w:t xml:space="preserve">- Import/Export file danh mục để cập nhật hàng loạt.</w:t>
+      </w:r>
+    </w:p>
+    <w:p>
+      <w:r>
+        <w:t xml:space="preserve">- Đảm bảo không trùng mã và dữ liệu bắt buộc đầy đủ trước khi lưu.</w:t>
       </w:r>
     </w:p>
     <w:p>
@@ -1763,12 +1796,12 @@
     </w:p>
     <w:p>
       <w:r>
-        <w:t xml:space="preserve">(1) Thêm mới mã NVL nhanh tại màn tồn đầu kỳ, phục vụ nhập liệu khi phát sinh mã chưa có trong danh mục.</w:t>
-      </w:r>
-    </w:p>
-    <w:p>
-      <w:r>
-        <w:t xml:space="preserve">(2) Khai báo số lượng và giá trị tồn đầu kỳ theo từng mã/lô để làm số liệu nền trước khi chạy nghiệp vụ nhập xuất thực tế.</w:t>
+        <w:t xml:space="preserve">(1) Thực hiện import dữ liệu danh mục hàng loạt từ file mẫu, giảm thao tác nhập tay và đồng bộ dữ liệu chuẩn hóa.</w:t>
+      </w:r>
+    </w:p>
+    <w:p>
+      <w:r>
+        <w:t xml:space="preserve">(2) Vùng quản trị danh mục gốc của hệ thống (NVL, thành phẩm, đơn vị, nhóm...) ảnh hưởng trực tiếp đến dữ liệu nghiệp vụ.</w:t>
       </w:r>
     </w:p>
     <w:p>
@@ -1777,22 +1810,22 @@
         <w:spacing w:after="120" w:before="260"/>
       </w:pPr>
       <w:r>
-        <w:t xml:space="preserve">Bước 15. Chuyển kho nội bộ</w:t>
-      </w:r>
-    </w:p>
-    <w:p>
-      <w:r>
-        <w:t xml:space="preserve">- Tạo phiếu chuyển, bổ sung hàng hóa và số lượng cần luân chuyển.</w:t>
-      </w:r>
-    </w:p>
-    <w:p>
-      <w:r>
-        <w:t xml:space="preserve">- Lưu nháp và xác nhận phiếu khi đã kiểm tra tồn kho nguồn.</w:t>
-      </w:r>
-    </w:p>
-    <w:p>
-      <w:r>
-        <w:t xml:space="preserve">- Theo dõi trạng thái đến khi kho đích đã nhận.</w:t>
+        <w:t xml:space="preserve">Bước 16. Khai báo tồn kho đầu kỳ</w:t>
+      </w:r>
+    </w:p>
+    <w:p>
+      <w:r>
+        <w:t xml:space="preserve">- Nhập thông tin lô, số lượng, đơn giá, nhà cung cấp và ngày liên quan.</w:t>
+      </w:r>
+    </w:p>
+    <w:p>
+      <w:r>
+        <w:t xml:space="preserve">- Nhập số lượng theo quy tắc parse và format thống nhất trong hệ thống.</w:t>
+      </w:r>
+    </w:p>
+    <w:p>
+      <w:r>
+        <w:t xml:space="preserve">- Import file nếu cần khởi tạo nhiều dòng dữ liệu.</w:t>
       </w:r>
     </w:p>
     <w:p>
@@ -1855,12 +1888,12 @@
     </w:p>
     <w:p>
       <w:r>
-        <w:t xml:space="preserve">(1) Khai báo kho nguồn, kho đích và thông tin điều chuyển nội bộ để theo dõi luồng hàng giữa các kho.</w:t>
-      </w:r>
-    </w:p>
-    <w:p>
-      <w:r>
-        <w:t xml:space="preserve">(2) Xác nhận thao tác chuyển kho sau khi kiểm tra tồn nguồn và danh sách hàng chuyển, đảm bảo tính chính xác trước khi ghi nhận.</w:t>
+        <w:t xml:space="preserve">(1) Thêm mới mã NVL nhanh tại màn tồn đầu kỳ, phục vụ nhập liệu khi phát sinh mã chưa có trong danh mục.</w:t>
+      </w:r>
+    </w:p>
+    <w:p>
+      <w:r>
+        <w:t xml:space="preserve">(2) Khai báo số lượng và giá trị tồn đầu kỳ theo từng mã/lô để làm số liệu nền trước khi chạy nghiệp vụ nhập xuất thực tế.</w:t>
       </w:r>
     </w:p>
     <w:p>
@@ -1869,22 +1902,22 @@
         <w:spacing w:after="120" w:before="260"/>
       </w:pPr>
       <w:r>
-        <w:t xml:space="preserve">Bước 16. Quản lý người dùng</w:t>
-      </w:r>
-    </w:p>
-    <w:p>
-      <w:r>
-        <w:t xml:space="preserve">- Tạo tài khoản mới, cấp vai trò và trạng thái hoạt động.</w:t>
-      </w:r>
-    </w:p>
-    <w:p>
-      <w:r>
-        <w:t xml:space="preserve">- Đặt lại mật khẩu khi người dùng quên mật khẩu.</w:t>
-      </w:r>
-    </w:p>
-    <w:p>
-      <w:r>
-        <w:t xml:space="preserve">- Khóa hoặc xóa mềm tài khoản theo quy định vận hành.</w:t>
+        <w:t xml:space="preserve">Bước 17. Chuyển kho nội bộ</w:t>
+      </w:r>
+    </w:p>
+    <w:p>
+      <w:r>
+        <w:t xml:space="preserve">- Tạo phiếu chuyển, bổ sung hàng hóa và số lượng cần luân chuyển.</w:t>
+      </w:r>
+    </w:p>
+    <w:p>
+      <w:r>
+        <w:t xml:space="preserve">- Lưu nháp và xác nhận phiếu khi đã kiểm tra tồn kho nguồn.</w:t>
+      </w:r>
+    </w:p>
+    <w:p>
+      <w:r>
+        <w:t xml:space="preserve">- Theo dõi trạng thái đến khi kho đích đã nhận.</w:t>
       </w:r>
     </w:p>
     <w:p>
@@ -1947,12 +1980,12 @@
     </w:p>
     <w:p>
       <w:r>
-        <w:t xml:space="preserve">(1) Khởi tạo người dùng mới, gán vai trò phù hợp và thiết lập trạng thái hoạt động để kiểm soát quyền truy cập hệ thống.</w:t>
-      </w:r>
-    </w:p>
-    <w:p>
-      <w:r>
-        <w:t xml:space="preserve">(2) Theo dõi trạng thái tài khoản, vai trò và thao tác quản trị như đặt lại mật khẩu, khóa/mở tài khoản.</w:t>
+        <w:t xml:space="preserve">(1) Khai báo kho nguồn, kho đích và thông tin điều chuyển nội bộ để theo dõi luồng hàng giữa các kho.</w:t>
+      </w:r>
+    </w:p>
+    <w:p>
+      <w:r>
+        <w:t xml:space="preserve">(2) Xác nhận thao tác chuyển kho sau khi kiểm tra tồn nguồn và danh sách hàng chuyển, đảm bảo tính chính xác trước khi ghi nhận.</w:t>
       </w:r>
     </w:p>
     <w:p>
@@ -1961,17 +1994,22 @@
         <w:spacing w:after="120" w:before="260"/>
       </w:pPr>
       <w:r>
-        <w:t xml:space="preserve">Bước 17. Ma trận phân quyền vai trò</w:t>
-      </w:r>
-    </w:p>
-    <w:p>
-      <w:r>
-        <w:t xml:space="preserve">- Tra cứu nhanh vai trò nào có quyền xem/ghi/xóa theo từng phân hệ.</w:t>
-      </w:r>
-    </w:p>
-    <w:p>
-      <w:r>
-        <w:t xml:space="preserve">- Dùng để đối chiếu khi gặp lỗi không có quyền truy cập.</w:t>
+        <w:t xml:space="preserve">Bước 18. Quản lý người dùng</w:t>
+      </w:r>
+    </w:p>
+    <w:p>
+      <w:r>
+        <w:t xml:space="preserve">- Tạo tài khoản mới, cấp vai trò và trạng thái hoạt động.</w:t>
+      </w:r>
+    </w:p>
+    <w:p>
+      <w:r>
+        <w:t xml:space="preserve">- Đặt lại mật khẩu khi người dùng quên mật khẩu.</w:t>
+      </w:r>
+    </w:p>
+    <w:p>
+      <w:r>
+        <w:t xml:space="preserve">- Khóa hoặc xóa mềm tài khoản theo quy định vận hành.</w:t>
       </w:r>
     </w:p>
     <w:p>
@@ -2034,12 +2072,12 @@
     </w:p>
     <w:p>
       <w:r>
-        <w:t xml:space="preserve">(1) Xác định rõ màn hình ma trận quyền theo vai trò để kiểm tra phạm vi truy cập và chỉnh sửa của từng nhóm người dùng.</w:t>
-      </w:r>
-    </w:p>
-    <w:p>
-      <w:r>
-        <w:t xml:space="preserve">(2) Bảng chi tiết quyền xem/thêm/sửa/xóa theo từng chức năng, dùng để cấu hình và rà soát phân quyền chuẩn.</w:t>
+        <w:t xml:space="preserve">(1) Khởi tạo người dùng mới, gán vai trò phù hợp và thiết lập trạng thái hoạt động để kiểm soát quyền truy cập hệ thống.</w:t>
+      </w:r>
+    </w:p>
+    <w:p>
+      <w:r>
+        <w:t xml:space="preserve">(2) Theo dõi trạng thái tài khoản, vai trò và thao tác quản trị như đặt lại mật khẩu, khóa/mở tài khoản.</w:t>
       </w:r>
     </w:p>
     <w:p>
@@ -2048,17 +2086,17 @@
         <w:spacing w:after="120" w:before="260"/>
       </w:pPr>
       <w:r>
-        <w:t xml:space="preserve">Bước 18. Tài khoản của tôi</w:t>
-      </w:r>
-    </w:p>
-    <w:p>
-      <w:r>
-        <w:t xml:space="preserve">- Cập nhật họ tên/email cho tài khoản đang đăng nhập.</w:t>
-      </w:r>
-    </w:p>
-    <w:p>
-      <w:r>
-        <w:t xml:space="preserve">- Đổi mật khẩu định kỳ để đảm bảo an toàn.</w:t>
+        <w:t xml:space="preserve">Bước 19. Ma trận phân quyền vai trò</w:t>
+      </w:r>
+    </w:p>
+    <w:p>
+      <w:r>
+        <w:t xml:space="preserve">- Tra cứu nhanh vai trò nào có quyền xem/ghi/xóa theo từng phân hệ.</w:t>
+      </w:r>
+    </w:p>
+    <w:p>
+      <w:r>
+        <w:t xml:space="preserve">- Dùng để đối chiếu khi gặp lỗi không có quyền truy cập.</w:t>
       </w:r>
     </w:p>
     <w:p>
@@ -2086,6 +2124,93 @@
                   </pic:nvPicPr>
                   <pic:blipFill>
                     <a:blip r:embed="rId29" cstate="none"/>
+                    <a:srcRect/>
+                    <a:stretch>
+                      <a:fillRect/>
+                    </a:stretch>
+                  </pic:blipFill>
+                  <pic:spPr bwMode="auto">
+                    <a:xfrm>
+                      <a:off x="0" y="0"/>
+                      <a:ext cx="10287000" cy="5791200"/>
+                    </a:xfrm>
+                    <a:prstGeom prst="rect">
+                      <a:avLst/>
+                    </a:prstGeom>
+                  </pic:spPr>
+                </pic:pic>
+              </a:graphicData>
+            </a:graphic>
+          </wp:inline>
+        </w:drawing>
+      </w:r>
+    </w:p>
+    <w:p>
+      <w:pPr>
+        <w:spacing w:after="40" w:before="20"/>
+      </w:pPr>
+      <w:r>
+        <w:rPr>
+          <w:b/>
+          <w:bCs/>
+        </w:rPr>
+        <w:t xml:space="preserve">Chú thích chi tiết vùng khoanh đỏ:</w:t>
+      </w:r>
+    </w:p>
+    <w:p>
+      <w:r>
+        <w:t xml:space="preserve">(1) Xác định rõ màn hình ma trận quyền theo vai trò để kiểm tra phạm vi truy cập và chỉnh sửa của từng nhóm người dùng.</w:t>
+      </w:r>
+    </w:p>
+    <w:p>
+      <w:r>
+        <w:t xml:space="preserve">(2) Bảng chi tiết quyền xem/thêm/sửa/xóa theo từng chức năng, dùng để cấu hình và rà soát phân quyền chuẩn.</w:t>
+      </w:r>
+    </w:p>
+    <w:p>
+      <w:pPr>
+        <w:pStyle w:val="Heading2"/>
+        <w:spacing w:after="120" w:before="260"/>
+      </w:pPr>
+      <w:r>
+        <w:t xml:space="preserve">Bước 20. Tài khoản của tôi</w:t>
+      </w:r>
+    </w:p>
+    <w:p>
+      <w:r>
+        <w:t xml:space="preserve">- Cập nhật họ tên/email cho tài khoản đang đăng nhập.</w:t>
+      </w:r>
+    </w:p>
+    <w:p>
+      <w:r>
+        <w:t xml:space="preserve">- Đổi mật khẩu định kỳ để đảm bảo an toàn.</w:t>
+      </w:r>
+    </w:p>
+    <w:p>
+      <w:pPr>
+        <w:spacing w:after="200" w:before="120"/>
+        <w:jc w:val="center"/>
+      </w:pPr>
+      <w:r>
+        <w:drawing>
+          <wp:inline distT="0" distB="0" distL="0" distR="0">
+            <wp:extent cx="10287000" cy="5791200"/>
+            <wp:effectExtent t="0" r="0" b="0" l="0"/>
+            <wp:docPr id="1" name="" descr="" title=""/>
+            <wp:cNvGraphicFramePr>
+              <a:graphicFrameLocks xmlns:a="http://schemas.openxmlformats.org/drawingml/2006/main" noChangeAspect="1"/>
+            </wp:cNvGraphicFramePr>
+            <a:graphic xmlns:a="http://schemas.openxmlformats.org/drawingml/2006/main">
+              <a:graphicData uri="http://schemas.openxmlformats.org/drawingml/2006/picture">
+                <pic:pic xmlns:pic="http://schemas.openxmlformats.org/drawingml/2006/picture">
+                  <pic:nvPicPr>
+                    <pic:cNvPr id="0" name="" descr=""/>
+                    <pic:cNvPicPr>
+                      <a:picLocks noChangeAspect="1" noChangeArrowheads="1"/>
+                    </pic:cNvPicPr>
+                  </pic:nvPicPr>
+                  <pic:blipFill>
+                    <a:blip r:embed="rId30" cstate="none"/>
                     <a:srcRect/>
                     <a:stretch>
                       <a:fillRect/>

</xml_diff>